<commit_message>
Document user-driven map-first product pivot
</commit_message>
<xml_diff>
--- a/Hangtime_Rubric_Submission.docx
+++ b/Hangtime_Rubric_Submission.docx
@@ -129,11 +129,7 @@
     </w:p>
     <w:p>
       <w:r>
-        <w:rPr>
-          <w:b w:val="0"/>
-          <w:i w:val="0"/>
-        </w:rPr>
-        <w:t>The original concept emphasized matching one group with another. Exploratory conversations produced a more important insight: prospective users first wanted to know where people were going and what the broader night looked like. That evidence changed the product hierarchy. Hangtime is now map-first and planning-first; matching remains available after a destination and time become relevant.</w:t>
+        <w:t>The original concept emphasized matching one group with another. One exploratory user interaction produced a more important insight: matching felt off, while seeing where people were going and understanding the broader night felt useful. That evidence changed the product hierarchy. Hangtime is now map-first and planning-first; matching remains available after a destination and time become relevant.</w:t>
       </w:r>
     </w:p>
     <w:p>
@@ -3590,34 +3586,12 @@
     </w:p>
     <w:p>
       <w:r>
-        <w:rPr>
-          <w:b w:val="0"/>
-          <w:i w:val="0"/>
-        </w:rPr>
-        <w:t>Exploratory testers communicated two consistent needs: they wanted to know where people were going, and they placed greater value on understanding the overall night-out ecosystem than on browsing isolated groups. They emphasized planning, deals, location context, and information about the night. Adding location also created a need for clearer privacy and security behavior.</w:t>
+        <w:t>One exploratory user interaction was reported by the project owner. The wording supplied was: 'The matching itself felt off, but the ability to follow trends, see where people are, like a one spot hub for going out and seeing where people are.' This led to greater emphasis on planning, aggregate crowd geography, zones, deals, and ride costs.</w:t>
       </w:r>
     </w:p>
     <w:p>
       <w:r>
-        <w:rPr>
-          <w:b w:val="0"/>
-          <w:i w:val="0"/>
-        </w:rPr>
-        <w:t xml:space="preserve">The supplied evidence did not include a reliable participant count, research dates, recordings, or consented verbatim quotations. This submission therefore treats the finding as </w:t>
-      </w:r>
-      <w:r>
-        <w:rPr>
-          <w:b/>
-          <w:i w:val="0"/>
-        </w:rPr>
-        <w:t>directional qualitative evidence</w:t>
-      </w:r>
-      <w:r>
-        <w:rPr>
-          <w:b w:val="0"/>
-          <w:i w:val="0"/>
-        </w:rPr>
-        <w:t>, not validated demand. It does not invent a sample size or quotes.</w:t>
+        <w:t>The original interaction date, participant characteristics, recording, and structured task results were not supplied. This submission therefore treats the finding as directional qualitative evidence, not validated demand or a completed usability test.</w:t>
       </w:r>
     </w:p>
     <w:p>

</xml_diff>